<commit_message>
fix: justificación y alineación de encabezados en .docx generado
- scripts/redactar_v1.py: _add_para colapsa \n simples a espacios
  para evitar <w:br/> que el estilo justificado estira con huecos
- boilerplate/pie_firma.md: cada campo como párrafo independiente
- plantillas/plantilla_base.docx:
  - Body Text (Textoindependiente) con jc=both → cuerpo justificado
  - Heading 2: w:suff=space + ind left=360 hanging=360
    (antes: tab a pos=5540 → texto desplazado ~9 cm)

Otras mejoras varias en scripts y referencia.

Co-Authored-By: Claude Opus 4.7 <noreply@anthropic.com>
</commit_message>
<xml_diff>
--- a/plantillas/plantilla_base.docx
+++ b/plantillas/plantilla_base.docx
@@ -3717,13 +3717,11 @@
       <w:start w:val="1"/>
       <w:numFmt w:val="decimal"/>
       <w:pStyle w:val="Ttulo2"/>
+      <w:suff w:val="space"/>
       <w:lvlText w:val="%1.%2.-"/>
       <w:lvlJc w:val="left"/>
       <w:pPr>
-        <w:tabs>
-          <w:tab w:val="num" w:pos="5540"/>
-        </w:tabs>
-        <w:ind w:left="5103" w:hanging="283"/>
+        <w:ind w:left="360" w:hanging="360"/>
       </w:pPr>
       <w:rPr>
         <w:rFonts w:hint="default"/>
@@ -8836,7 +8834,7 @@
     <w:qFormat/>
     <w:rsid w:val="000F6D58"/>
     <w:pPr>
-      <w:jc w:val="both"/>
+      <w:jc w:val="left"/>
     </w:pPr>
     <w:rPr>
       <w:rFonts w:ascii="Arial" w:hAnsi="Arial"/>
@@ -9963,6 +9961,7 @@
     <w:rsid w:val="00CF67CD"/>
     <w:pPr>
       <w:spacing w:after="120"/>
+      <w:jc w:val="both"/>
     </w:pPr>
   </w:style>
   <w:style w:type="character" w:customStyle="1" w:styleId="TextoindependienteCar">

</xml_diff>